<commit_message>
Muck Rack replaces Robinson and Casey in today's five
Social Media Manager, remote, $97k-$120k (pay tier A). Built with the
same steps as the other picks; the honesty check fixed 4 lines. Ledger,
tracker, and daily log updated.

Co-Authored-By: Claude Opus 5.5 <noreply@anthropic.com>
Claude-Session: https://claude.ai/code/session_01VpCXqDFSAKkK8y6mKL2HCw
</commit_message>
<xml_diff>
--- a/applications/muck-rack-social-media-manager/build/Joshua_Chappell_CoverLetter_MuckRack.docx
+++ b/applications/muck-rack-social-media-manager/build/Joshua_Chappell_CoverLetter_MuckRack.docx
@@ -27,7 +27,7 @@
         </w:rPr>
         <w:t xml:space="preserve">Mesa, AZ  •  480-586-7959  •  </w:t>
       </w:r>
-      <w:hyperlink w:history="1" r:id="rId0qik2x6hk7mbwuzobhlej">
+      <w:hyperlink w:history="1" r:id="rId-hhwmlmhuxq8ltyjzysyt">
         <w:r>
           <w:rPr>
             <w:rFonts w:ascii="Calibri" w:cs="Calibri" w:eastAsia="Calibri" w:hAnsi="Calibri"/>
@@ -47,7 +47,7 @@
         </w:rPr>
         <w:t xml:space="preserve">  •  </w:t>
       </w:r>
-      <w:hyperlink w:history="1" r:id="rIdfaz2lemrcm76mpmagbmuj">
+      <w:hyperlink w:history="1" r:id="rIdxpddqvzz10cqyrchkbs89">
         <w:r>
           <w:rPr>
             <w:rFonts w:ascii="Calibri" w:cs="Calibri" w:eastAsia="Calibri" w:hAnsi="Calibri"/>
@@ -67,7 +67,7 @@
         </w:rPr>
         <w:t xml:space="preserve">  •  </w:t>
       </w:r>
-      <w:hyperlink w:history="1" r:id="rIdu-hbkofn74_qi7wygfmar">
+      <w:hyperlink w:history="1" r:id="rIdupaykydrhjr9_tz9imlu6">
         <w:r>
           <w:rPr>
             <w:rFonts w:ascii="Calibri" w:cs="Calibri" w:eastAsia="Calibri" w:hAnsi="Calibri"/>
@@ -87,7 +87,7 @@
         </w:rPr>
         <w:t xml:space="preserve">  •  </w:t>
       </w:r>
-      <w:hyperlink w:history="1" r:id="rIdxbefuuk6spyza3pbj5oee">
+      <w:hyperlink w:history="1" r:id="rIdbd_tuitbetd7tcxpcwmdl">
         <w:r>
           <w:rPr>
             <w:rFonts w:ascii="Calibri" w:cs="Calibri" w:eastAsia="Calibri" w:hAnsi="Calibri"/>
@@ -138,7 +138,7 @@
           <w:sz w:val="22"/>
           <w:szCs w:val="22"/>
         </w:rPr>
-        <w:t xml:space="preserve">Your posting asks for someone creative, organized and metrics-driven who can carry video production across LinkedIn, Instagram, TikTok, and X. Video is the core of my work. At Charter One I created and led a social media content initiative that drove more than 20x the engagement of standard content, and I led video initiatives that drove paid and organic engagement by over 100%. At Grand Canyon Education I scripted original organic content with the marketing team and delivered 200+ videos over two years reaching millions on TV, paid social, and organic channels. I script, shoot, and edit in-house, so your social calendar does not wait on an outside crew.</w:t>
+        <w:t xml:space="preserve">Your posting asks for someone creative, organized and metrics-driven, with experience in video production, scripting and editing. Video is the core of my work. At Charter One I created and led a social media content initiative that drove more than 20x the engagement of standard content, and I led video initiatives that drove paid and organic engagement by over 100%. At Grand Canyon Education I scripted original organic content with the marketing team and delivered 200+ videos over two years reaching millions on TV, paid social, and organic channels. I script, shoot, and edit in-house, so your social calendar does not wait on an outside crew.</w:t>
       </w:r>
     </w:p>
     <w:p>

</xml_diff>